<commit_message>
Fix: hapus halaman kosong, perkecil spacing, rapihkan layout
</commit_message>
<xml_diff>
--- a/Panduan_Scalping_Edisi_Lengkap.docx
+++ b/Panduan_Scalping_Edisi_Lengkap.docx
@@ -4,7 +4,7 @@
   <w:body>
     <w:p>
       <w:pPr>
-        <w:spacing w:before="600" w:after="20" w:line="276" w:lineRule="auto"/>
+        <w:spacing w:before="200" w:after="20" w:line="276" w:lineRule="auto"/>
         <w:shd w:val="clear" w:color="auto" w:fill="C9A227"/>
       </w:pPr>
       <w:r>
@@ -18,7 +18,7 @@
     <w:p>
       <w:pPr>
         <w:jc w:val="center"/>
-        <w:spacing w:before="400" w:after="120" w:line="276" w:lineRule="auto"/>
+        <w:spacing w:before="200" w:after="120" w:line="276" w:lineRule="auto"/>
         <w:shd w:val="clear" w:color="auto" w:fill="0D2745"/>
       </w:pPr>
       <w:r>
@@ -54,7 +54,7 @@
     <w:p>
       <w:pPr>
         <w:jc w:val="center"/>
-        <w:spacing w:before="0" w:after="400" w:line="276" w:lineRule="auto"/>
+        <w:spacing w:before="0" w:after="120" w:line="276" w:lineRule="auto"/>
         <w:shd w:val="clear" w:color="auto" w:fill="0D2745"/>
       </w:pPr>
       <w:r>
@@ -119,13 +119,8 @@
       </w:r>
     </w:p>
     <w:p>
-      <w:r>
-        <w:br w:type="page"/>
-      </w:r>
-    </w:p>
-    <w:p>
-      <w:pPr>
-        <w:spacing w:before="400" w:after="20" w:line="276" w:lineRule="auto"/>
+      <w:pPr>
+        <w:spacing w:before="120" w:after="10" w:line="276" w:lineRule="auto"/>
         <w:shd w:val="clear" w:color="auto" w:fill="0D2745"/>
       </w:pPr>
       <w:r>
@@ -175,7 +170,7 @@
     <w:p>
       <w:pPr>
         <w:jc w:val="center"/>
-        <w:spacing w:before="0" w:after="400" w:line="276" w:lineRule="auto"/>
+        <w:spacing w:before="0" w:after="120" w:line="276" w:lineRule="auto"/>
         <w:shd w:val="clear" w:color="auto" w:fill="0D2745"/>
       </w:pPr>
       <w:r>
@@ -192,7 +187,7 @@
     </w:p>
     <w:p>
       <w:pPr>
-        <w:spacing w:before="20" w:after="20" w:line="276" w:lineRule="auto"/>
+        <w:spacing w:before="10" w:after="10" w:line="276" w:lineRule="auto"/>
         <w:shd w:val="clear" w:color="auto" w:fill="0D2745"/>
       </w:pPr>
       <w:r>
@@ -1033,7 +1028,7 @@
     </w:p>
     <w:p>
       <w:pPr>
-        <w:spacing w:before="120" w:after="0" w:line="240" w:lineRule="auto"/>
+        <w:spacing w:before="120" w:after="0" w:line="260" w:lineRule="auto"/>
         <w:ind w:left="120"/>
         <w:shd w:val="clear" w:color="auto" w:fill="F5F5F5"/>
       </w:pPr>
@@ -1184,7 +1179,7 @@
     </w:p>
     <w:p>
       <w:pPr>
-        <w:spacing w:before="0" w:after="120" w:line="240" w:lineRule="auto"/>
+        <w:spacing w:before="0" w:after="120" w:line="260" w:lineRule="auto"/>
         <w:ind w:left="120"/>
         <w:shd w:val="clear" w:color="auto" w:fill="F5F5F5"/>
       </w:pPr>
@@ -2052,7 +2047,7 @@
     </w:p>
     <w:p>
       <w:pPr>
-        <w:spacing w:before="160" w:after="0" w:line="240" w:lineRule="auto"/>
+        <w:spacing w:before="160" w:after="0" w:line="260" w:lineRule="auto"/>
         <w:ind w:left="120"/>
         <w:shd w:val="clear" w:color="auto" w:fill="1B1F23"/>
       </w:pPr>
@@ -2098,7 +2093,7 @@
     </w:p>
     <w:p>
       <w:pPr>
-        <w:spacing w:before="0" w:after="160" w:line="240" w:lineRule="auto"/>
+        <w:spacing w:before="0" w:after="160" w:line="260" w:lineRule="auto"/>
         <w:ind w:left="120"/>
         <w:shd w:val="clear" w:color="auto" w:fill="1B1F23"/>
       </w:pPr>
@@ -3262,13 +3257,8 @@
       </w:r>
     </w:p>
     <w:p>
-      <w:r>
-        <w:br w:type="page"/>
-      </w:r>
-    </w:p>
-    <w:p>
-      <w:pPr>
-        <w:spacing w:before="400" w:after="20" w:line="276" w:lineRule="auto"/>
+      <w:pPr>
+        <w:spacing w:before="120" w:after="10" w:line="276" w:lineRule="auto"/>
         <w:shd w:val="clear" w:color="auto" w:fill="0D2745"/>
       </w:pPr>
       <w:r>
@@ -3318,7 +3308,7 @@
     <w:p>
       <w:pPr>
         <w:jc w:val="center"/>
-        <w:spacing w:before="0" w:after="400" w:line="276" w:lineRule="auto"/>
+        <w:spacing w:before="0" w:after="120" w:line="276" w:lineRule="auto"/>
         <w:shd w:val="clear" w:color="auto" w:fill="0D2745"/>
       </w:pPr>
       <w:r>
@@ -3335,7 +3325,7 @@
     </w:p>
     <w:p>
       <w:pPr>
-        <w:spacing w:before="20" w:after="20" w:line="276" w:lineRule="auto"/>
+        <w:spacing w:before="10" w:after="10" w:line="276" w:lineRule="auto"/>
         <w:shd w:val="clear" w:color="auto" w:fill="0D2745"/>
       </w:pPr>
       <w:r>
@@ -3400,7 +3390,7 @@
     </w:p>
     <w:p>
       <w:pPr>
-        <w:spacing w:before="120" w:after="0" w:line="240" w:lineRule="auto"/>
+        <w:spacing w:before="120" w:after="0" w:line="260" w:lineRule="auto"/>
         <w:ind w:left="120"/>
         <w:shd w:val="clear" w:color="auto" w:fill="F5F5F5"/>
       </w:pPr>
@@ -3611,7 +3601,7 @@
     </w:p>
     <w:p>
       <w:pPr>
-        <w:spacing w:before="0" w:after="120" w:line="240" w:lineRule="auto"/>
+        <w:spacing w:before="0" w:after="120" w:line="260" w:lineRule="auto"/>
         <w:ind w:left="120"/>
         <w:shd w:val="clear" w:color="auto" w:fill="F5F5F5"/>
       </w:pPr>
@@ -4848,13 +4838,8 @@
       </w:r>
     </w:p>
     <w:p>
-      <w:r>
-        <w:br w:type="page"/>
-      </w:r>
-    </w:p>
-    <w:p>
-      <w:pPr>
-        <w:spacing w:before="400" w:after="20" w:line="276" w:lineRule="auto"/>
+      <w:pPr>
+        <w:spacing w:before="120" w:after="10" w:line="276" w:lineRule="auto"/>
         <w:shd w:val="clear" w:color="auto" w:fill="0D2745"/>
       </w:pPr>
       <w:r>
@@ -4904,7 +4889,7 @@
     <w:p>
       <w:pPr>
         <w:jc w:val="center"/>
-        <w:spacing w:before="0" w:after="400" w:line="276" w:lineRule="auto"/>
+        <w:spacing w:before="0" w:after="120" w:line="276" w:lineRule="auto"/>
         <w:shd w:val="clear" w:color="auto" w:fill="0D2745"/>
       </w:pPr>
       <w:r>
@@ -4921,7 +4906,7 @@
     </w:p>
     <w:p>
       <w:pPr>
-        <w:spacing w:before="20" w:after="20" w:line="276" w:lineRule="auto"/>
+        <w:spacing w:before="10" w:after="10" w:line="276" w:lineRule="auto"/>
         <w:shd w:val="clear" w:color="auto" w:fill="0D2745"/>
       </w:pPr>
       <w:r>
@@ -4968,7 +4953,7 @@
     </w:p>
     <w:p>
       <w:pPr>
-        <w:spacing w:before="120" w:after="0" w:line="240" w:lineRule="auto"/>
+        <w:spacing w:before="120" w:after="0" w:line="260" w:lineRule="auto"/>
         <w:ind w:left="120"/>
         <w:shd w:val="clear" w:color="auto" w:fill="F5F5F5"/>
       </w:pPr>
@@ -5164,7 +5149,7 @@
     </w:p>
     <w:p>
       <w:pPr>
-        <w:spacing w:before="0" w:after="120" w:line="240" w:lineRule="auto"/>
+        <w:spacing w:before="0" w:after="120" w:line="260" w:lineRule="auto"/>
         <w:ind w:left="120"/>
         <w:shd w:val="clear" w:color="auto" w:fill="F5F5F5"/>
       </w:pPr>
@@ -5680,13 +5665,8 @@
       </w:r>
     </w:p>
     <w:p>
-      <w:r>
-        <w:br w:type="page"/>
-      </w:r>
-    </w:p>
-    <w:p>
-      <w:pPr>
-        <w:spacing w:before="400" w:after="20" w:line="276" w:lineRule="auto"/>
+      <w:pPr>
+        <w:spacing w:before="120" w:after="10" w:line="276" w:lineRule="auto"/>
         <w:shd w:val="clear" w:color="auto" w:fill="0D2745"/>
       </w:pPr>
       <w:r>
@@ -5736,7 +5716,7 @@
     <w:p>
       <w:pPr>
         <w:jc w:val="center"/>
-        <w:spacing w:before="0" w:after="400" w:line="276" w:lineRule="auto"/>
+        <w:spacing w:before="0" w:after="120" w:line="276" w:lineRule="auto"/>
         <w:shd w:val="clear" w:color="auto" w:fill="0D2745"/>
       </w:pPr>
       <w:r>
@@ -5753,7 +5733,7 @@
     </w:p>
     <w:p>
       <w:pPr>
-        <w:spacing w:before="20" w:after="20" w:line="276" w:lineRule="auto"/>
+        <w:spacing w:before="10" w:after="10" w:line="276" w:lineRule="auto"/>
         <w:shd w:val="clear" w:color="auto" w:fill="0D2745"/>
       </w:pPr>
       <w:r>
@@ -5787,7 +5767,7 @@
     </w:p>
     <w:p>
       <w:pPr>
-        <w:spacing w:before="120" w:after="0" w:line="240" w:lineRule="auto"/>
+        <w:spacing w:before="120" w:after="0" w:line="260" w:lineRule="auto"/>
         <w:ind w:left="120"/>
         <w:shd w:val="clear" w:color="auto" w:fill="F5F5F5"/>
       </w:pPr>
@@ -5998,7 +5978,7 @@
     </w:p>
     <w:p>
       <w:pPr>
-        <w:spacing w:before="0" w:after="120" w:line="240" w:lineRule="auto"/>
+        <w:spacing w:before="0" w:after="120" w:line="260" w:lineRule="auto"/>
         <w:ind w:left="120"/>
         <w:shd w:val="clear" w:color="auto" w:fill="F5F5F5"/>
       </w:pPr>
@@ -6491,7 +6471,7 @@
     </w:p>
     <w:p>
       <w:pPr>
-        <w:spacing w:before="120" w:after="0" w:line="240" w:lineRule="auto"/>
+        <w:spacing w:before="120" w:after="0" w:line="260" w:lineRule="auto"/>
         <w:ind w:left="120"/>
         <w:shd w:val="clear" w:color="auto" w:fill="F5F5F5"/>
       </w:pPr>
@@ -6657,7 +6637,7 @@
     </w:p>
     <w:p>
       <w:pPr>
-        <w:spacing w:before="0" w:after="120" w:line="240" w:lineRule="auto"/>
+        <w:spacing w:before="0" w:after="120" w:line="260" w:lineRule="auto"/>
         <w:ind w:left="120"/>
         <w:shd w:val="clear" w:color="auto" w:fill="F5F5F5"/>
       </w:pPr>
@@ -7910,13 +7890,8 @@
       </w:r>
     </w:p>
     <w:p>
-      <w:r>
-        <w:br w:type="page"/>
-      </w:r>
-    </w:p>
-    <w:p>
-      <w:pPr>
-        <w:spacing w:before="400" w:after="20" w:line="276" w:lineRule="auto"/>
+      <w:pPr>
+        <w:spacing w:before="120" w:after="10" w:line="276" w:lineRule="auto"/>
         <w:shd w:val="clear" w:color="auto" w:fill="0D2745"/>
       </w:pPr>
       <w:r>
@@ -7966,7 +7941,7 @@
     <w:p>
       <w:pPr>
         <w:jc w:val="center"/>
-        <w:spacing w:before="0" w:after="400" w:line="276" w:lineRule="auto"/>
+        <w:spacing w:before="0" w:after="120" w:line="276" w:lineRule="auto"/>
         <w:shd w:val="clear" w:color="auto" w:fill="0D2745"/>
       </w:pPr>
       <w:r>
@@ -7983,7 +7958,7 @@
     </w:p>
     <w:p>
       <w:pPr>
-        <w:spacing w:before="20" w:after="20" w:line="276" w:lineRule="auto"/>
+        <w:spacing w:before="10" w:after="10" w:line="276" w:lineRule="auto"/>
         <w:shd w:val="clear" w:color="auto" w:fill="0D2745"/>
       </w:pPr>
       <w:r>
@@ -8285,7 +8260,7 @@
     </w:p>
     <w:p>
       <w:pPr>
-        <w:spacing w:before="120" w:after="0" w:line="240" w:lineRule="auto"/>
+        <w:spacing w:before="120" w:after="0" w:line="260" w:lineRule="auto"/>
         <w:ind w:left="120"/>
         <w:shd w:val="clear" w:color="auto" w:fill="F5F5F5"/>
       </w:pPr>
@@ -8421,7 +8396,7 @@
     </w:p>
     <w:p>
       <w:pPr>
-        <w:spacing w:before="0" w:after="120" w:line="240" w:lineRule="auto"/>
+        <w:spacing w:before="0" w:after="120" w:line="260" w:lineRule="auto"/>
         <w:ind w:left="120"/>
         <w:shd w:val="clear" w:color="auto" w:fill="F5F5F5"/>
       </w:pPr>
@@ -8600,7 +8575,7 @@
     </w:p>
     <w:p>
       <w:pPr>
-        <w:spacing w:before="120" w:after="0" w:line="240" w:lineRule="auto"/>
+        <w:spacing w:before="120" w:after="0" w:line="260" w:lineRule="auto"/>
         <w:ind w:left="120"/>
         <w:shd w:val="clear" w:color="auto" w:fill="F5F5F5"/>
       </w:pPr>
@@ -8766,7 +8741,7 @@
     </w:p>
     <w:p>
       <w:pPr>
-        <w:spacing w:before="0" w:after="120" w:line="240" w:lineRule="auto"/>
+        <w:spacing w:before="0" w:after="120" w:line="260" w:lineRule="auto"/>
         <w:ind w:left="120"/>
         <w:shd w:val="clear" w:color="auto" w:fill="F5F5F5"/>
       </w:pPr>
@@ -8945,7 +8920,7 @@
     </w:p>
     <w:p>
       <w:pPr>
-        <w:spacing w:before="120" w:after="0" w:line="240" w:lineRule="auto"/>
+        <w:spacing w:before="120" w:after="0" w:line="260" w:lineRule="auto"/>
         <w:ind w:left="120"/>
         <w:shd w:val="clear" w:color="auto" w:fill="F5F5F5"/>
       </w:pPr>
@@ -9126,7 +9101,7 @@
     </w:p>
     <w:p>
       <w:pPr>
-        <w:spacing w:before="0" w:after="120" w:line="240" w:lineRule="auto"/>
+        <w:spacing w:before="0" w:after="120" w:line="260" w:lineRule="auto"/>
         <w:ind w:left="120"/>
         <w:shd w:val="clear" w:color="auto" w:fill="F5F5F5"/>
       </w:pPr>
@@ -9828,7 +9803,7 @@
     </w:p>
     <w:p>
       <w:pPr>
-        <w:spacing w:before="120" w:after="0" w:line="240" w:lineRule="auto"/>
+        <w:spacing w:before="120" w:after="0" w:line="260" w:lineRule="auto"/>
         <w:ind w:left="120"/>
         <w:shd w:val="clear" w:color="auto" w:fill="F5F5F5"/>
       </w:pPr>
@@ -10249,7 +10224,7 @@
     </w:p>
     <w:p>
       <w:pPr>
-        <w:spacing w:before="0" w:after="120" w:line="240" w:lineRule="auto"/>
+        <w:spacing w:before="0" w:after="120" w:line="260" w:lineRule="auto"/>
         <w:ind w:left="120"/>
         <w:shd w:val="clear" w:color="auto" w:fill="F5F5F5"/>
       </w:pPr>
@@ -10466,13 +10441,8 @@
       </w:r>
     </w:p>
     <w:p>
-      <w:r>
-        <w:br w:type="page"/>
-      </w:r>
-    </w:p>
-    <w:p>
-      <w:pPr>
-        <w:spacing w:before="400" w:after="20" w:line="276" w:lineRule="auto"/>
+      <w:pPr>
+        <w:spacing w:before="120" w:after="10" w:line="276" w:lineRule="auto"/>
         <w:shd w:val="clear" w:color="auto" w:fill="0D2745"/>
       </w:pPr>
       <w:r>
@@ -10522,7 +10492,7 @@
     <w:p>
       <w:pPr>
         <w:jc w:val="center"/>
-        <w:spacing w:before="0" w:after="400" w:line="276" w:lineRule="auto"/>
+        <w:spacing w:before="0" w:after="120" w:line="276" w:lineRule="auto"/>
         <w:shd w:val="clear" w:color="auto" w:fill="0D2745"/>
       </w:pPr>
       <w:r>
@@ -10539,7 +10509,7 @@
     </w:p>
     <w:p>
       <w:pPr>
-        <w:spacing w:before="20" w:after="20" w:line="276" w:lineRule="auto"/>
+        <w:spacing w:before="10" w:after="10" w:line="276" w:lineRule="auto"/>
         <w:shd w:val="clear" w:color="auto" w:fill="0D2745"/>
       </w:pPr>
       <w:r>
@@ -11252,7 +11222,7 @@
     </w:p>
     <w:p>
       <w:pPr>
-        <w:spacing w:before="160" w:after="160" w:line="240" w:lineRule="auto"/>
+        <w:spacing w:before="160" w:after="160" w:line="260" w:lineRule="auto"/>
         <w:ind w:left="120"/>
         <w:shd w:val="clear" w:color="auto" w:fill="1B1F23"/>
       </w:pPr>
@@ -11368,7 +11338,7 @@
     </w:p>
     <w:p>
       <w:pPr>
-        <w:spacing w:before="160" w:after="160" w:line="240" w:lineRule="auto"/>
+        <w:spacing w:before="160" w:after="160" w:line="260" w:lineRule="auto"/>
         <w:ind w:left="120"/>
         <w:shd w:val="clear" w:color="auto" w:fill="1B1F23"/>
       </w:pPr>
@@ -11484,7 +11454,7 @@
     </w:p>
     <w:p>
       <w:pPr>
-        <w:spacing w:before="160" w:after="160" w:line="240" w:lineRule="auto"/>
+        <w:spacing w:before="160" w:after="160" w:line="260" w:lineRule="auto"/>
         <w:ind w:left="120"/>
         <w:shd w:val="clear" w:color="auto" w:fill="1B1F23"/>
       </w:pPr>
@@ -11600,7 +11570,7 @@
     </w:p>
     <w:p>
       <w:pPr>
-        <w:spacing w:before="160" w:after="160" w:line="240" w:lineRule="auto"/>
+        <w:spacing w:before="160" w:after="160" w:line="260" w:lineRule="auto"/>
         <w:ind w:left="120"/>
         <w:shd w:val="clear" w:color="auto" w:fill="1B1F23"/>
       </w:pPr>
@@ -11716,7 +11686,7 @@
     </w:p>
     <w:p>
       <w:pPr>
-        <w:spacing w:before="160" w:after="160" w:line="240" w:lineRule="auto"/>
+        <w:spacing w:before="160" w:after="160" w:line="260" w:lineRule="auto"/>
         <w:ind w:left="120"/>
         <w:shd w:val="clear" w:color="auto" w:fill="1B1F23"/>
       </w:pPr>
@@ -11832,7 +11802,7 @@
     </w:p>
     <w:p>
       <w:pPr>
-        <w:spacing w:before="160" w:after="160" w:line="240" w:lineRule="auto"/>
+        <w:spacing w:before="160" w:after="160" w:line="260" w:lineRule="auto"/>
         <w:ind w:left="120"/>
         <w:shd w:val="clear" w:color="auto" w:fill="1B1F23"/>
       </w:pPr>
@@ -11948,7 +11918,7 @@
     </w:p>
     <w:p>
       <w:pPr>
-        <w:spacing w:before="160" w:after="160" w:line="240" w:lineRule="auto"/>
+        <w:spacing w:before="160" w:after="160" w:line="260" w:lineRule="auto"/>
         <w:ind w:left="120"/>
         <w:shd w:val="clear" w:color="auto" w:fill="1B1F23"/>
       </w:pPr>
@@ -12064,7 +12034,7 @@
     </w:p>
     <w:p>
       <w:pPr>
-        <w:spacing w:before="160" w:after="160" w:line="240" w:lineRule="auto"/>
+        <w:spacing w:before="160" w:after="160" w:line="260" w:lineRule="auto"/>
         <w:ind w:left="120"/>
         <w:shd w:val="clear" w:color="auto" w:fill="1B1F23"/>
       </w:pPr>
@@ -12180,7 +12150,7 @@
     </w:p>
     <w:p>
       <w:pPr>
-        <w:spacing w:before="160" w:after="160" w:line="240" w:lineRule="auto"/>
+        <w:spacing w:before="160" w:after="160" w:line="260" w:lineRule="auto"/>
         <w:ind w:left="120"/>
         <w:shd w:val="clear" w:color="auto" w:fill="1B1F23"/>
       </w:pPr>
@@ -12296,7 +12266,7 @@
     </w:p>
     <w:p>
       <w:pPr>
-        <w:spacing w:before="160" w:after="160" w:line="240" w:lineRule="auto"/>
+        <w:spacing w:before="160" w:after="160" w:line="260" w:lineRule="auto"/>
         <w:ind w:left="120"/>
         <w:shd w:val="clear" w:color="auto" w:fill="1B1F23"/>
       </w:pPr>
@@ -12412,7 +12382,7 @@
     </w:p>
     <w:p>
       <w:pPr>
-        <w:spacing w:before="160" w:after="160" w:line="240" w:lineRule="auto"/>
+        <w:spacing w:before="160" w:after="160" w:line="260" w:lineRule="auto"/>
         <w:ind w:left="120"/>
         <w:shd w:val="clear" w:color="auto" w:fill="1B1F23"/>
       </w:pPr>
@@ -12528,7 +12498,7 @@
     </w:p>
     <w:p>
       <w:pPr>
-        <w:spacing w:before="160" w:after="160" w:line="240" w:lineRule="auto"/>
+        <w:spacing w:before="160" w:after="160" w:line="260" w:lineRule="auto"/>
         <w:ind w:left="120"/>
         <w:shd w:val="clear" w:color="auto" w:fill="1B1F23"/>
       </w:pPr>
@@ -14043,13 +14013,8 @@
       </w:r>
     </w:p>
     <w:p>
-      <w:r>
-        <w:br w:type="page"/>
-      </w:r>
-    </w:p>
-    <w:p>
-      <w:pPr>
-        <w:spacing w:before="400" w:after="20" w:line="276" w:lineRule="auto"/>
+      <w:pPr>
+        <w:spacing w:before="120" w:after="10" w:line="276" w:lineRule="auto"/>
         <w:shd w:val="clear" w:color="auto" w:fill="0D2745"/>
       </w:pPr>
       <w:r>
@@ -14099,7 +14064,7 @@
     <w:p>
       <w:pPr>
         <w:jc w:val="center"/>
-        <w:spacing w:before="0" w:after="400" w:line="276" w:lineRule="auto"/>
+        <w:spacing w:before="0" w:after="120" w:line="276" w:lineRule="auto"/>
         <w:shd w:val="clear" w:color="auto" w:fill="0D2745"/>
       </w:pPr>
       <w:r>
@@ -14116,7 +14081,7 @@
     </w:p>
     <w:p>
       <w:pPr>
-        <w:spacing w:before="20" w:after="20" w:line="276" w:lineRule="auto"/>
+        <w:spacing w:before="10" w:after="10" w:line="276" w:lineRule="auto"/>
         <w:shd w:val="clear" w:color="auto" w:fill="0D2745"/>
       </w:pPr>
       <w:r>
@@ -14165,7 +14130,7 @@
     </w:p>
     <w:p>
       <w:pPr>
-        <w:spacing w:before="160" w:after="160" w:line="240" w:lineRule="auto"/>
+        <w:spacing w:before="160" w:after="160" w:line="260" w:lineRule="auto"/>
         <w:ind w:left="120"/>
         <w:shd w:val="clear" w:color="auto" w:fill="1B1F23"/>
       </w:pPr>
@@ -14197,7 +14162,7 @@
     </w:p>
     <w:p>
       <w:pPr>
-        <w:spacing w:before="160" w:after="160" w:line="240" w:lineRule="auto"/>
+        <w:spacing w:before="160" w:after="160" w:line="260" w:lineRule="auto"/>
         <w:ind w:left="120"/>
         <w:shd w:val="clear" w:color="auto" w:fill="1B1F23"/>
       </w:pPr>
@@ -14229,7 +14194,7 @@
     </w:p>
     <w:p>
       <w:pPr>
-        <w:spacing w:before="160" w:after="160" w:line="240" w:lineRule="auto"/>
+        <w:spacing w:before="160" w:after="160" w:line="260" w:lineRule="auto"/>
         <w:ind w:left="120"/>
         <w:shd w:val="clear" w:color="auto" w:fill="1B1F23"/>
       </w:pPr>
@@ -14261,7 +14226,7 @@
     </w:p>
     <w:p>
       <w:pPr>
-        <w:spacing w:before="160" w:after="160" w:line="240" w:lineRule="auto"/>
+        <w:spacing w:before="160" w:after="160" w:line="260" w:lineRule="auto"/>
         <w:ind w:left="120"/>
         <w:shd w:val="clear" w:color="auto" w:fill="1B1F23"/>
       </w:pPr>
@@ -14293,7 +14258,7 @@
     </w:p>
     <w:p>
       <w:pPr>
-        <w:spacing w:before="160" w:after="160" w:line="240" w:lineRule="auto"/>
+        <w:spacing w:before="160" w:after="160" w:line="260" w:lineRule="auto"/>
         <w:ind w:left="120"/>
         <w:shd w:val="clear" w:color="auto" w:fill="1B1F23"/>
       </w:pPr>
@@ -14325,7 +14290,7 @@
     </w:p>
     <w:p>
       <w:pPr>
-        <w:spacing w:before="160" w:after="160" w:line="240" w:lineRule="auto"/>
+        <w:spacing w:before="160" w:after="160" w:line="260" w:lineRule="auto"/>
         <w:ind w:left="120"/>
         <w:shd w:val="clear" w:color="auto" w:fill="1B1F23"/>
       </w:pPr>
@@ -14357,7 +14322,7 @@
     </w:p>
     <w:p>
       <w:pPr>
-        <w:spacing w:before="160" w:after="160" w:line="240" w:lineRule="auto"/>
+        <w:spacing w:before="160" w:after="160" w:line="260" w:lineRule="auto"/>
         <w:ind w:left="120"/>
         <w:shd w:val="clear" w:color="auto" w:fill="1B1F23"/>
       </w:pPr>
@@ -14389,7 +14354,7 @@
     </w:p>
     <w:p>
       <w:pPr>
-        <w:spacing w:before="160" w:after="160" w:line="240" w:lineRule="auto"/>
+        <w:spacing w:before="160" w:after="160" w:line="260" w:lineRule="auto"/>
         <w:ind w:left="120"/>
         <w:shd w:val="clear" w:color="auto" w:fill="1B1F23"/>
       </w:pPr>
@@ -14421,7 +14386,7 @@
     </w:p>
     <w:p>
       <w:pPr>
-        <w:spacing w:before="160" w:after="160" w:line="240" w:lineRule="auto"/>
+        <w:spacing w:before="160" w:after="160" w:line="260" w:lineRule="auto"/>
         <w:ind w:left="120"/>
         <w:shd w:val="clear" w:color="auto" w:fill="1B1F23"/>
       </w:pPr>
@@ -14453,7 +14418,7 @@
     </w:p>
     <w:p>
       <w:pPr>
-        <w:spacing w:before="160" w:after="160" w:line="240" w:lineRule="auto"/>
+        <w:spacing w:before="160" w:after="160" w:line="260" w:lineRule="auto"/>
         <w:ind w:left="120"/>
         <w:shd w:val="clear" w:color="auto" w:fill="1B1F23"/>
       </w:pPr>
@@ -14485,7 +14450,7 @@
     </w:p>
     <w:p>
       <w:pPr>
-        <w:spacing w:before="160" w:after="160" w:line="240" w:lineRule="auto"/>
+        <w:spacing w:before="160" w:after="160" w:line="260" w:lineRule="auto"/>
         <w:ind w:left="120"/>
         <w:shd w:val="clear" w:color="auto" w:fill="1B1F23"/>
       </w:pPr>
@@ -14517,7 +14482,7 @@
     </w:p>
     <w:p>
       <w:pPr>
-        <w:spacing w:before="160" w:after="160" w:line="240" w:lineRule="auto"/>
+        <w:spacing w:before="160" w:after="160" w:line="260" w:lineRule="auto"/>
         <w:ind w:left="120"/>
         <w:shd w:val="clear" w:color="auto" w:fill="1B1F23"/>
       </w:pPr>
@@ -14948,13 +14913,8 @@
       </w:r>
     </w:p>
     <w:p>
-      <w:r>
-        <w:br w:type="page"/>
-      </w:r>
-    </w:p>
-    <w:p>
-      <w:pPr>
-        <w:spacing w:before="400" w:after="20" w:line="276" w:lineRule="auto"/>
+      <w:pPr>
+        <w:spacing w:before="120" w:after="10" w:line="276" w:lineRule="auto"/>
         <w:shd w:val="clear" w:color="auto" w:fill="0D2745"/>
       </w:pPr>
       <w:r>
@@ -15004,7 +14964,7 @@
     <w:p>
       <w:pPr>
         <w:jc w:val="center"/>
-        <w:spacing w:before="0" w:after="400" w:line="276" w:lineRule="auto"/>
+        <w:spacing w:before="0" w:after="120" w:line="276" w:lineRule="auto"/>
         <w:shd w:val="clear" w:color="auto" w:fill="0D2745"/>
       </w:pPr>
       <w:r>
@@ -15021,7 +14981,7 @@
     </w:p>
     <w:p>
       <w:pPr>
-        <w:spacing w:before="20" w:after="20" w:line="276" w:lineRule="auto"/>
+        <w:spacing w:before="10" w:after="10" w:line="276" w:lineRule="auto"/>
         <w:shd w:val="clear" w:color="auto" w:fill="0D2745"/>
       </w:pPr>
       <w:r>
@@ -15055,7 +15015,7 @@
     </w:p>
     <w:p>
       <w:pPr>
-        <w:spacing w:before="160" w:after="0" w:line="240" w:lineRule="auto"/>
+        <w:spacing w:before="160" w:after="0" w:line="260" w:lineRule="auto"/>
         <w:ind w:left="120"/>
         <w:shd w:val="clear" w:color="auto" w:fill="1B1F23"/>
       </w:pPr>
@@ -15116,7 +15076,7 @@
     </w:p>
     <w:p>
       <w:pPr>
-        <w:spacing w:before="0" w:after="160" w:line="240" w:lineRule="auto"/>
+        <w:spacing w:before="0" w:after="160" w:line="260" w:lineRule="auto"/>
         <w:ind w:left="120"/>
         <w:shd w:val="clear" w:color="auto" w:fill="1B1F23"/>
       </w:pPr>
@@ -15528,7 +15488,7 @@
     </w:p>
     <w:p>
       <w:pPr>
-        <w:spacing w:before="160" w:after="0" w:line="240" w:lineRule="auto"/>
+        <w:spacing w:before="160" w:after="0" w:line="260" w:lineRule="auto"/>
         <w:ind w:left="120"/>
         <w:shd w:val="clear" w:color="auto" w:fill="1B1F23"/>
       </w:pPr>
@@ -15574,7 +15534,7 @@
     </w:p>
     <w:p>
       <w:pPr>
-        <w:spacing w:before="0" w:after="160" w:line="240" w:lineRule="auto"/>
+        <w:spacing w:before="0" w:after="160" w:line="260" w:lineRule="auto"/>
         <w:ind w:left="120"/>
         <w:shd w:val="clear" w:color="auto" w:fill="1B1F23"/>
       </w:pPr>
@@ -16562,13 +16522,8 @@
       </w:r>
     </w:p>
     <w:p>
-      <w:r>
-        <w:br w:type="page"/>
-      </w:r>
-    </w:p>
-    <w:p>
-      <w:pPr>
-        <w:spacing w:before="400" w:after="20" w:line="276" w:lineRule="auto"/>
+      <w:pPr>
+        <w:spacing w:before="120" w:after="10" w:line="276" w:lineRule="auto"/>
         <w:shd w:val="clear" w:color="auto" w:fill="0D2745"/>
       </w:pPr>
       <w:r>
@@ -16618,7 +16573,7 @@
     <w:p>
       <w:pPr>
         <w:jc w:val="center"/>
-        <w:spacing w:before="0" w:after="400" w:line="276" w:lineRule="auto"/>
+        <w:spacing w:before="0" w:after="120" w:line="276" w:lineRule="auto"/>
         <w:shd w:val="clear" w:color="auto" w:fill="0D2745"/>
       </w:pPr>
       <w:r>
@@ -16635,7 +16590,7 @@
     </w:p>
     <w:p>
       <w:pPr>
-        <w:spacing w:before="20" w:after="20" w:line="276" w:lineRule="auto"/>
+        <w:spacing w:before="10" w:after="10" w:line="276" w:lineRule="auto"/>
         <w:shd w:val="clear" w:color="auto" w:fill="0D2745"/>
       </w:pPr>
       <w:r>
@@ -17228,7 +17183,7 @@
     </w:p>
     <w:p>
       <w:pPr>
-        <w:spacing w:before="120" w:after="0" w:line="240" w:lineRule="auto"/>
+        <w:spacing w:before="120" w:after="0" w:line="260" w:lineRule="auto"/>
         <w:ind w:left="120"/>
         <w:shd w:val="clear" w:color="auto" w:fill="F5F5F5"/>
       </w:pPr>
@@ -17349,7 +17304,7 @@
     </w:p>
     <w:p>
       <w:pPr>
-        <w:spacing w:before="0" w:after="120" w:line="240" w:lineRule="auto"/>
+        <w:spacing w:before="0" w:after="120" w:line="260" w:lineRule="auto"/>
         <w:ind w:left="120"/>
         <w:shd w:val="clear" w:color="auto" w:fill="F5F5F5"/>
       </w:pPr>
@@ -17839,13 +17794,8 @@
       </w:r>
     </w:p>
     <w:p>
-      <w:r>
-        <w:br w:type="page"/>
-      </w:r>
-    </w:p>
-    <w:p>
-      <w:pPr>
-        <w:spacing w:before="400" w:after="20" w:line="276" w:lineRule="auto"/>
+      <w:pPr>
+        <w:spacing w:before="120" w:after="10" w:line="276" w:lineRule="auto"/>
         <w:shd w:val="clear" w:color="auto" w:fill="0D2745"/>
       </w:pPr>
       <w:r>
@@ -17895,7 +17845,7 @@
     <w:p>
       <w:pPr>
         <w:jc w:val="center"/>
-        <w:spacing w:before="0" w:after="400" w:line="276" w:lineRule="auto"/>
+        <w:spacing w:before="0" w:after="120" w:line="276" w:lineRule="auto"/>
         <w:shd w:val="clear" w:color="auto" w:fill="0D2745"/>
       </w:pPr>
       <w:r>
@@ -17912,7 +17862,7 @@
     </w:p>
     <w:p>
       <w:pPr>
-        <w:spacing w:before="20" w:after="20" w:line="276" w:lineRule="auto"/>
+        <w:spacing w:before="10" w:after="10" w:line="276" w:lineRule="auto"/>
         <w:shd w:val="clear" w:color="auto" w:fill="0D2745"/>
       </w:pPr>
       <w:r>
@@ -17961,7 +17911,7 @@
     </w:p>
     <w:p>
       <w:pPr>
-        <w:spacing w:before="160" w:after="160" w:line="240" w:lineRule="auto"/>
+        <w:spacing w:before="160" w:after="160" w:line="260" w:lineRule="auto"/>
         <w:ind w:left="120"/>
         <w:shd w:val="clear" w:color="auto" w:fill="1B1F23"/>
       </w:pPr>
@@ -17992,7 +17942,7 @@
     </w:p>
     <w:p>
       <w:pPr>
-        <w:spacing w:before="160" w:after="160" w:line="240" w:lineRule="auto"/>
+        <w:spacing w:before="160" w:after="160" w:line="260" w:lineRule="auto"/>
         <w:ind w:left="120"/>
         <w:shd w:val="clear" w:color="auto" w:fill="1B1F23"/>
       </w:pPr>
@@ -18023,7 +17973,7 @@
     </w:p>
     <w:p>
       <w:pPr>
-        <w:spacing w:before="160" w:after="160" w:line="240" w:lineRule="auto"/>
+        <w:spacing w:before="160" w:after="160" w:line="260" w:lineRule="auto"/>
         <w:ind w:left="120"/>
         <w:shd w:val="clear" w:color="auto" w:fill="1B1F23"/>
       </w:pPr>
@@ -18054,7 +18004,7 @@
     </w:p>
     <w:p>
       <w:pPr>
-        <w:spacing w:before="160" w:after="160" w:line="240" w:lineRule="auto"/>
+        <w:spacing w:before="160" w:after="160" w:line="260" w:lineRule="auto"/>
         <w:ind w:left="120"/>
         <w:shd w:val="clear" w:color="auto" w:fill="1B1F23"/>
       </w:pPr>
@@ -18085,7 +18035,7 @@
     </w:p>
     <w:p>
       <w:pPr>
-        <w:spacing w:before="160" w:after="160" w:line="240" w:lineRule="auto"/>
+        <w:spacing w:before="160" w:after="160" w:line="260" w:lineRule="auto"/>
         <w:ind w:left="120"/>
         <w:shd w:val="clear" w:color="auto" w:fill="1B1F23"/>
       </w:pPr>
@@ -18116,7 +18066,7 @@
     </w:p>
     <w:p>
       <w:pPr>
-        <w:spacing w:before="160" w:after="160" w:line="240" w:lineRule="auto"/>
+        <w:spacing w:before="160" w:after="160" w:line="260" w:lineRule="auto"/>
         <w:ind w:left="120"/>
         <w:shd w:val="clear" w:color="auto" w:fill="1B1F23"/>
       </w:pPr>
@@ -18147,7 +18097,7 @@
     </w:p>
     <w:p>
       <w:pPr>
-        <w:spacing w:before="160" w:after="160" w:line="240" w:lineRule="auto"/>
+        <w:spacing w:before="160" w:after="160" w:line="260" w:lineRule="auto"/>
         <w:ind w:left="120"/>
         <w:shd w:val="clear" w:color="auto" w:fill="1B1F23"/>
       </w:pPr>
@@ -18178,7 +18128,7 @@
     </w:p>
     <w:p>
       <w:pPr>
-        <w:spacing w:before="160" w:after="160" w:line="240" w:lineRule="auto"/>
+        <w:spacing w:before="160" w:after="160" w:line="260" w:lineRule="auto"/>
         <w:ind w:left="120"/>
         <w:shd w:val="clear" w:color="auto" w:fill="1B1F23"/>
       </w:pPr>
@@ -18209,7 +18159,7 @@
     </w:p>
     <w:p>
       <w:pPr>
-        <w:spacing w:before="160" w:after="160" w:line="240" w:lineRule="auto"/>
+        <w:spacing w:before="160" w:after="160" w:line="260" w:lineRule="auto"/>
         <w:ind w:left="120"/>
         <w:shd w:val="clear" w:color="auto" w:fill="1B1F23"/>
       </w:pPr>
@@ -18240,7 +18190,7 @@
     </w:p>
     <w:p>
       <w:pPr>
-        <w:spacing w:before="160" w:after="160" w:line="240" w:lineRule="auto"/>
+        <w:spacing w:before="160" w:after="160" w:line="260" w:lineRule="auto"/>
         <w:ind w:left="120"/>
         <w:shd w:val="clear" w:color="auto" w:fill="1B1F23"/>
       </w:pPr>
@@ -18271,7 +18221,7 @@
     </w:p>
     <w:p>
       <w:pPr>
-        <w:spacing w:before="160" w:after="160" w:line="240" w:lineRule="auto"/>
+        <w:spacing w:before="160" w:after="160" w:line="260" w:lineRule="auto"/>
         <w:ind w:left="120"/>
         <w:shd w:val="clear" w:color="auto" w:fill="1B1F23"/>
       </w:pPr>
@@ -18302,7 +18252,7 @@
     </w:p>
     <w:p>
       <w:pPr>
-        <w:spacing w:before="160" w:after="160" w:line="240" w:lineRule="auto"/>
+        <w:spacing w:before="160" w:after="160" w:line="260" w:lineRule="auto"/>
         <w:ind w:left="120"/>
         <w:shd w:val="clear" w:color="auto" w:fill="1B1F23"/>
       </w:pPr>
@@ -18339,7 +18289,7 @@
     </w:p>
     <w:p>
       <w:pPr>
-        <w:spacing w:before="160" w:after="0" w:line="240" w:lineRule="auto"/>
+        <w:spacing w:before="160" w:after="0" w:line="260" w:lineRule="auto"/>
         <w:ind w:left="120"/>
         <w:shd w:val="clear" w:color="auto" w:fill="1B1F23"/>
       </w:pPr>
@@ -18400,7 +18350,7 @@
     </w:p>
     <w:p>
       <w:pPr>
-        <w:spacing w:before="0" w:after="160" w:line="240" w:lineRule="auto"/>
+        <w:spacing w:before="0" w:after="160" w:line="260" w:lineRule="auto"/>
         <w:ind w:left="120"/>
         <w:shd w:val="clear" w:color="auto" w:fill="1B1F23"/>
       </w:pPr>
@@ -18605,7 +18555,7 @@
     </w:p>
     <w:p>
       <w:pPr>
-        <w:spacing w:before="400" w:after="160" w:line="276" w:lineRule="auto"/>
+        <w:spacing w:before="200" w:after="120" w:line="276" w:lineRule="auto"/>
       </w:pPr>
       <w:r>
         <w:rPr>

</xml_diff>

<commit_message>
Fix AGRESIF: hapus semua halaman kosong, padatkan spacing, konten mengalir tanpa break
</commit_message>
<xml_diff>
--- a/Panduan_Scalping_Edisi_Lengkap.docx
+++ b/Panduan_Scalping_Edisi_Lengkap.docx
@@ -4,7 +4,7 @@
   <w:body>
     <w:p>
       <w:pPr>
-        <w:spacing w:before="200" w:after="20" w:line="276" w:lineRule="auto"/>
+        <w:spacing w:before="100" w:after="20" w:line="276" w:lineRule="auto"/>
         <w:shd w:val="clear" w:color="auto" w:fill="C9A227"/>
       </w:pPr>
       <w:r>
@@ -18,7 +18,7 @@
     <w:p>
       <w:pPr>
         <w:jc w:val="center"/>
-        <w:spacing w:before="200" w:after="120" w:line="276" w:lineRule="auto"/>
+        <w:spacing w:before="100" w:after="120" w:line="276" w:lineRule="auto"/>
         <w:shd w:val="clear" w:color="auto" w:fill="0D2745"/>
       </w:pPr>
       <w:r>
@@ -84,7 +84,7 @@
     <w:p>
       <w:pPr>
         <w:jc w:val="center"/>
-        <w:spacing w:before="300" w:after="200" w:line="276" w:lineRule="auto"/>
+        <w:spacing w:before="120" w:after="80" w:line="276" w:lineRule="auto"/>
       </w:pPr>
       <w:r>
         <w:rPr>
@@ -100,7 +100,7 @@
     <w:p>
       <w:pPr>
         <w:jc w:val="center"/>
-        <w:spacing w:before="200" w:after="120" w:line="276" w:lineRule="auto"/>
+        <w:spacing w:before="100" w:after="120" w:line="276" w:lineRule="auto"/>
       </w:pPr>
       <w:r>
         <w:rPr>
@@ -199,13 +199,21 @@
       </w:r>
     </w:p>
     <w:p>
-      <w:r>
-        <w:br w:type="page"/>
-      </w:r>
-    </w:p>
-    <w:p>
-      <w:pPr>
-        <w:spacing w:before="280" w:after="120" w:line="276" w:lineRule="auto"/>
+      <w:pPr>
+        <w:spacing w:before="60" w:after="60"/>
+        <w:shd w:val="clear" w:color="auto" w:fill="C9A227"/>
+      </w:pPr>
+      <w:r>
+        <w:rPr>
+          <w:sz w:val="2"/>
+          <w:szCs w:val="2"/>
+        </w:rPr>
+        <w:t xml:space="preserve"> </w:t>
+      </w:r>
+    </w:p>
+    <w:p>
+      <w:pPr>
+        <w:spacing w:before="100" w:after="120" w:line="276" w:lineRule="auto"/>
       </w:pPr>
       <w:r>
         <w:rPr>
@@ -536,19 +544,7 @@
     </w:tbl>
     <w:p>
       <w:pPr>
-        <w:spacing w:before="0" w:after="120" w:line="276" w:lineRule="auto"/>
-      </w:pPr>
-      <w:r>
-        <w:rPr>
-          <w:sz w:val="2"/>
-          <w:szCs w:val="2"/>
-        </w:rPr>
-        <w:t xml:space="preserve"> </w:t>
-      </w:r>
-    </w:p>
-    <w:p>
-      <w:pPr>
-        <w:spacing w:before="280" w:after="120" w:line="276" w:lineRule="auto"/>
+        <w:spacing w:before="100" w:after="120" w:line="276" w:lineRule="auto"/>
       </w:pPr>
       <w:r>
         <w:rPr>
@@ -1000,19 +996,7 @@
     </w:tbl>
     <w:p>
       <w:pPr>
-        <w:spacing w:before="0" w:after="120" w:line="276" w:lineRule="auto"/>
-      </w:pPr>
-      <w:r>
-        <w:rPr>
-          <w:sz w:val="2"/>
-          <w:szCs w:val="2"/>
-        </w:rPr>
-        <w:t xml:space="preserve"> </w:t>
-      </w:r>
-    </w:p>
-    <w:p>
-      <w:pPr>
-        <w:spacing w:before="280" w:after="120" w:line="276" w:lineRule="auto"/>
+        <w:spacing w:before="100" w:after="120" w:line="276" w:lineRule="auto"/>
       </w:pPr>
       <w:r>
         <w:rPr>
@@ -1210,7 +1194,7 @@
     </w:p>
     <w:p>
       <w:pPr>
-        <w:spacing w:before="280" w:after="120" w:line="276" w:lineRule="auto"/>
+        <w:spacing w:before="100" w:after="120" w:line="276" w:lineRule="auto"/>
       </w:pPr>
       <w:r>
         <w:rPr>
@@ -1465,7 +1449,7 @@
     </w:p>
     <w:p>
       <w:pPr>
-        <w:spacing w:before="280" w:after="120" w:line="276" w:lineRule="auto"/>
+        <w:spacing w:before="100" w:after="120" w:line="276" w:lineRule="auto"/>
       </w:pPr>
       <w:r>
         <w:rPr>
@@ -1719,7 +1703,7 @@
     </w:p>
     <w:p>
       <w:pPr>
-        <w:spacing w:before="280" w:after="120" w:line="276" w:lineRule="auto"/>
+        <w:spacing w:before="100" w:after="120" w:line="276" w:lineRule="auto"/>
       </w:pPr>
       <w:r>
         <w:rPr>
@@ -2035,18 +2019,6 @@
     </w:tbl>
     <w:p>
       <w:pPr>
-        <w:spacing w:before="0" w:after="120" w:line="276" w:lineRule="auto"/>
-      </w:pPr>
-      <w:r>
-        <w:rPr>
-          <w:sz w:val="2"/>
-          <w:szCs w:val="2"/>
-        </w:rPr>
-        <w:t xml:space="preserve"> </w:t>
-      </w:r>
-    </w:p>
-    <w:p>
-      <w:pPr>
         <w:spacing w:before="160" w:after="0" w:line="260" w:lineRule="auto"/>
         <w:ind w:left="120"/>
         <w:shd w:val="clear" w:color="auto" w:fill="1B1F23"/>
@@ -2109,7 +2081,7 @@
     </w:p>
     <w:p>
       <w:pPr>
-        <w:spacing w:before="280" w:after="120" w:line="276" w:lineRule="auto"/>
+        <w:spacing w:before="100" w:after="120" w:line="276" w:lineRule="auto"/>
       </w:pPr>
       <w:r>
         <w:rPr>
@@ -3241,7 +3213,8 @@
     </w:tbl>
     <w:p>
       <w:pPr>
-        <w:spacing w:before="0" w:after="120" w:line="276" w:lineRule="auto"/>
+        <w:spacing w:before="60" w:after="60"/>
+        <w:shd w:val="clear" w:color="auto" w:fill="C9A227"/>
       </w:pPr>
       <w:r>
         <w:rPr>
@@ -3249,11 +3222,6 @@
           <w:szCs w:val="2"/>
         </w:rPr>
         <w:t xml:space="preserve"> </w:t>
-      </w:r>
-    </w:p>
-    <w:p>
-      <w:r>
-        <w:br w:type="page"/>
       </w:r>
     </w:p>
     <w:p>
@@ -3337,13 +3305,21 @@
       </w:r>
     </w:p>
     <w:p>
-      <w:r>
-        <w:br w:type="page"/>
-      </w:r>
-    </w:p>
-    <w:p>
-      <w:pPr>
-        <w:spacing w:before="280" w:after="120" w:line="276" w:lineRule="auto"/>
+      <w:pPr>
+        <w:spacing w:before="60" w:after="60"/>
+        <w:shd w:val="clear" w:color="auto" w:fill="C9A227"/>
+      </w:pPr>
+      <w:r>
+        <w:rPr>
+          <w:sz w:val="2"/>
+          <w:szCs w:val="2"/>
+        </w:rPr>
+        <w:t xml:space="preserve"> </w:t>
+      </w:r>
+    </w:p>
+    <w:p>
+      <w:pPr>
+        <w:spacing w:before="100" w:after="120" w:line="276" w:lineRule="auto"/>
       </w:pPr>
       <w:r>
         <w:rPr>
@@ -3374,7 +3350,7 @@
     </w:p>
     <w:p>
       <w:pPr>
-        <w:spacing w:before="280" w:after="120" w:line="276" w:lineRule="auto"/>
+        <w:spacing w:before="100" w:after="120" w:line="276" w:lineRule="auto"/>
       </w:pPr>
       <w:r>
         <w:rPr>
@@ -3985,18 +3961,6 @@
     </w:tbl>
     <w:p>
       <w:pPr>
-        <w:spacing w:before="0" w:after="120" w:line="276" w:lineRule="auto"/>
-      </w:pPr>
-      <w:r>
-        <w:rPr>
-          <w:sz w:val="2"/>
-          <w:szCs w:val="2"/>
-        </w:rPr>
-        <w:t xml:space="preserve"> </w:t>
-      </w:r>
-    </w:p>
-    <w:p>
-      <w:pPr>
         <w:spacing w:before="180" w:after="40" w:line="276" w:lineRule="auto"/>
         <w:ind w:left="120"/>
         <w:shd w:val="clear" w:color="auto" w:fill="FFEBEE"/>
@@ -4152,7 +4116,7 @@
     </w:p>
     <w:p>
       <w:pPr>
-        <w:spacing w:before="280" w:after="120" w:line="276" w:lineRule="auto"/>
+        <w:spacing w:before="100" w:after="120" w:line="276" w:lineRule="auto"/>
       </w:pPr>
       <w:r>
         <w:rPr>
@@ -4468,18 +4432,6 @@
     </w:tbl>
     <w:p>
       <w:pPr>
-        <w:spacing w:before="0" w:after="120" w:line="276" w:lineRule="auto"/>
-      </w:pPr>
-      <w:r>
-        <w:rPr>
-          <w:sz w:val="2"/>
-          <w:szCs w:val="2"/>
-        </w:rPr>
-        <w:t xml:space="preserve"> </w:t>
-      </w:r>
-    </w:p>
-    <w:p>
-      <w:pPr>
         <w:spacing w:before="180" w:after="40" w:line="276" w:lineRule="auto"/>
         <w:ind w:left="120"/>
         <w:shd w:val="clear" w:color="auto" w:fill="F3E5F5"/>
@@ -4698,7 +4650,7 @@
     </w:p>
     <w:p>
       <w:pPr>
-        <w:spacing w:before="280" w:after="120" w:line="276" w:lineRule="auto"/>
+        <w:spacing w:before="100" w:after="120" w:line="276" w:lineRule="auto"/>
       </w:pPr>
       <w:r>
         <w:rPr>
@@ -4833,8 +4785,16 @@
       </w:r>
     </w:p>
     <w:p>
-      <w:r>
-        <w:br w:type="page"/>
+      <w:pPr>
+        <w:spacing w:before="60" w:after="60"/>
+        <w:shd w:val="clear" w:color="auto" w:fill="C9A227"/>
+      </w:pPr>
+      <w:r>
+        <w:rPr>
+          <w:sz w:val="2"/>
+          <w:szCs w:val="2"/>
+        </w:rPr>
+        <w:t xml:space="preserve"> </w:t>
       </w:r>
     </w:p>
     <w:p>
@@ -4918,13 +4878,21 @@
       </w:r>
     </w:p>
     <w:p>
-      <w:r>
-        <w:br w:type="page"/>
-      </w:r>
-    </w:p>
-    <w:p>
-      <w:pPr>
-        <w:spacing w:before="280" w:after="120" w:line="276" w:lineRule="auto"/>
+      <w:pPr>
+        <w:spacing w:before="60" w:after="60"/>
+        <w:shd w:val="clear" w:color="auto" w:fill="C9A227"/>
+      </w:pPr>
+      <w:r>
+        <w:rPr>
+          <w:sz w:val="2"/>
+          <w:szCs w:val="2"/>
+        </w:rPr>
+        <w:t xml:space="preserve"> </w:t>
+      </w:r>
+    </w:p>
+    <w:p>
+      <w:pPr>
+        <w:spacing w:before="100" w:after="120" w:line="276" w:lineRule="auto"/>
       </w:pPr>
       <w:r>
         <w:rPr>
@@ -5165,7 +5133,7 @@
     </w:p>
     <w:p>
       <w:pPr>
-        <w:spacing w:before="280" w:after="120" w:line="276" w:lineRule="auto"/>
+        <w:spacing w:before="100" w:after="120" w:line="276" w:lineRule="auto"/>
       </w:pPr>
       <w:r>
         <w:rPr>
@@ -5181,7 +5149,7 @@
     </w:p>
     <w:p>
       <w:pPr>
-        <w:spacing w:before="200" w:after="100" w:line="276" w:lineRule="auto"/>
+        <w:spacing w:before="100" w:after="100" w:line="276" w:lineRule="auto"/>
       </w:pPr>
       <w:r>
         <w:rPr>
@@ -5210,7 +5178,7 @@
     </w:p>
     <w:p>
       <w:pPr>
-        <w:spacing w:before="200" w:after="100" w:line="276" w:lineRule="auto"/>
+        <w:spacing w:before="100" w:after="100" w:line="276" w:lineRule="auto"/>
       </w:pPr>
       <w:r>
         <w:rPr>
@@ -5239,7 +5207,7 @@
     </w:p>
     <w:p>
       <w:pPr>
-        <w:spacing w:before="200" w:after="100" w:line="276" w:lineRule="auto"/>
+        <w:spacing w:before="100" w:after="100" w:line="276" w:lineRule="auto"/>
       </w:pPr>
       <w:r>
         <w:rPr>
@@ -5268,7 +5236,7 @@
     </w:p>
     <w:p>
       <w:pPr>
-        <w:spacing w:before="200" w:after="100" w:line="276" w:lineRule="auto"/>
+        <w:spacing w:before="100" w:after="100" w:line="276" w:lineRule="auto"/>
       </w:pPr>
       <w:r>
         <w:rPr>
@@ -5297,7 +5265,7 @@
     </w:p>
     <w:p>
       <w:pPr>
-        <w:spacing w:before="200" w:after="100" w:line="276" w:lineRule="auto"/>
+        <w:spacing w:before="100" w:after="100" w:line="276" w:lineRule="auto"/>
       </w:pPr>
       <w:r>
         <w:rPr>
@@ -5326,7 +5294,7 @@
     </w:p>
     <w:p>
       <w:pPr>
-        <w:spacing w:before="200" w:after="100" w:line="276" w:lineRule="auto"/>
+        <w:spacing w:before="100" w:after="100" w:line="276" w:lineRule="auto"/>
       </w:pPr>
       <w:r>
         <w:rPr>
@@ -5510,7 +5478,7 @@
     </w:p>
     <w:p>
       <w:pPr>
-        <w:spacing w:before="280" w:after="120" w:line="276" w:lineRule="auto"/>
+        <w:spacing w:before="100" w:after="120" w:line="276" w:lineRule="auto"/>
       </w:pPr>
       <w:r>
         <w:rPr>
@@ -5660,8 +5628,16 @@
       </w:r>
     </w:p>
     <w:p>
-      <w:r>
-        <w:br w:type="page"/>
+      <w:pPr>
+        <w:spacing w:before="60" w:after="60"/>
+        <w:shd w:val="clear" w:color="auto" w:fill="C9A227"/>
+      </w:pPr>
+      <w:r>
+        <w:rPr>
+          <w:sz w:val="2"/>
+          <w:szCs w:val="2"/>
+        </w:rPr>
+        <w:t xml:space="preserve"> </w:t>
       </w:r>
     </w:p>
     <w:p>
@@ -5745,13 +5721,21 @@
       </w:r>
     </w:p>
     <w:p>
-      <w:r>
-        <w:br w:type="page"/>
-      </w:r>
-    </w:p>
-    <w:p>
-      <w:pPr>
-        <w:spacing w:before="280" w:after="120" w:line="276" w:lineRule="auto"/>
+      <w:pPr>
+        <w:spacing w:before="60" w:after="60"/>
+        <w:shd w:val="clear" w:color="auto" w:fill="C9A227"/>
+      </w:pPr>
+      <w:r>
+        <w:rPr>
+          <w:sz w:val="2"/>
+          <w:szCs w:val="2"/>
+        </w:rPr>
+        <w:t xml:space="preserve"> </w:t>
+      </w:r>
+    </w:p>
+    <w:p>
+      <w:pPr>
+        <w:spacing w:before="100" w:after="120" w:line="276" w:lineRule="auto"/>
       </w:pPr>
       <w:r>
         <w:rPr>
@@ -6430,19 +6414,7 @@
     </w:tbl>
     <w:p>
       <w:pPr>
-        <w:spacing w:before="0" w:after="120" w:line="276" w:lineRule="auto"/>
-      </w:pPr>
-      <w:r>
-        <w:rPr>
-          <w:sz w:val="2"/>
-          <w:szCs w:val="2"/>
-        </w:rPr>
-        <w:t xml:space="preserve"> </w:t>
-      </w:r>
-    </w:p>
-    <w:p>
-      <w:pPr>
-        <w:spacing w:before="280" w:after="120" w:line="276" w:lineRule="auto"/>
+        <w:spacing w:before="100" w:after="120" w:line="276" w:lineRule="auto"/>
       </w:pPr>
       <w:r>
         <w:rPr>
@@ -6653,7 +6625,7 @@
     </w:p>
     <w:p>
       <w:pPr>
-        <w:spacing w:before="200" w:after="100" w:line="276" w:lineRule="auto"/>
+        <w:spacing w:before="100" w:after="100" w:line="276" w:lineRule="auto"/>
       </w:pPr>
       <w:r>
         <w:rPr>
@@ -7037,19 +7009,7 @@
     </w:tbl>
     <w:p>
       <w:pPr>
-        <w:spacing w:before="0" w:after="120" w:line="276" w:lineRule="auto"/>
-      </w:pPr>
-      <w:r>
-        <w:rPr>
-          <w:sz w:val="2"/>
-          <w:szCs w:val="2"/>
-        </w:rPr>
-        <w:t xml:space="preserve"> </w:t>
-      </w:r>
-    </w:p>
-    <w:p>
-      <w:pPr>
-        <w:spacing w:before="280" w:after="120" w:line="276" w:lineRule="auto"/>
+        <w:spacing w:before="100" w:after="120" w:line="276" w:lineRule="auto"/>
       </w:pPr>
       <w:r>
         <w:rPr>
@@ -7287,18 +7247,6 @@
     </w:tbl>
     <w:p>
       <w:pPr>
-        <w:spacing w:before="0" w:after="120" w:line="276" w:lineRule="auto"/>
-      </w:pPr>
-      <w:r>
-        <w:rPr>
-          <w:sz w:val="2"/>
-          <w:szCs w:val="2"/>
-        </w:rPr>
-        <w:t xml:space="preserve"> </w:t>
-      </w:r>
-    </w:p>
-    <w:p>
-      <w:pPr>
         <w:spacing w:before="180" w:after="40" w:line="276" w:lineRule="auto"/>
         <w:ind w:left="120"/>
         <w:shd w:val="clear" w:color="auto" w:fill="E8F5E9"/>
@@ -7475,7 +7423,7 @@
     </w:p>
     <w:p>
       <w:pPr>
-        <w:spacing w:before="280" w:after="120" w:line="276" w:lineRule="auto"/>
+        <w:spacing w:before="100" w:after="120" w:line="276" w:lineRule="auto"/>
       </w:pPr>
       <w:r>
         <w:rPr>
@@ -7863,30 +7811,26 @@
       </w:pPr>
       <w:r>
         <w:rPr>
+          <w:b/>
+          <w:bCs/>
+          <w:color w:val="424242"/>
+          <w:sz w:val="22"/>
+          <w:szCs w:val="22"/>
+        </w:rPr>
+        <w:t xml:space="preserve">ATURAN EMAS: Jangan pernah percaya pergerakan harga TANPA konfirmasi volume. Volume besar = 2x MA20 volume.</w:t>
+      </w:r>
+    </w:p>
+    <w:p>
+      <w:pPr>
+        <w:spacing w:before="60" w:after="60"/>
+        <w:shd w:val="clear" w:color="auto" w:fill="C9A227"/>
+      </w:pPr>
+      <w:r>
+        <w:rPr>
           <w:sz w:val="2"/>
           <w:szCs w:val="2"/>
         </w:rPr>
         <w:t xml:space="preserve"> </w:t>
-      </w:r>
-    </w:p>
-    <w:p>
-      <w:pPr>
-        <w:spacing w:before="0" w:after="120" w:line="276" w:lineRule="auto"/>
-      </w:pPr>
-      <w:r>
-        <w:rPr>
-          <w:b/>
-          <w:bCs/>
-          <w:color w:val="424242"/>
-          <w:sz w:val="22"/>
-          <w:szCs w:val="22"/>
-        </w:rPr>
-        <w:t xml:space="preserve">ATURAN EMAS: Jangan pernah percaya pergerakan harga TANPA konfirmasi volume. Volume besar = 2x MA20 volume.</w:t>
-      </w:r>
-    </w:p>
-    <w:p>
-      <w:r>
-        <w:br w:type="page"/>
       </w:r>
     </w:p>
     <w:p>
@@ -7970,13 +7914,21 @@
       </w:r>
     </w:p>
     <w:p>
-      <w:r>
-        <w:br w:type="page"/>
-      </w:r>
-    </w:p>
-    <w:p>
-      <w:pPr>
-        <w:spacing w:before="280" w:after="120" w:line="276" w:lineRule="auto"/>
+      <w:pPr>
+        <w:spacing w:before="60" w:after="60"/>
+        <w:shd w:val="clear" w:color="auto" w:fill="C9A227"/>
+      </w:pPr>
+      <w:r>
+        <w:rPr>
+          <w:sz w:val="2"/>
+          <w:szCs w:val="2"/>
+        </w:rPr>
+        <w:t xml:space="preserve"> </w:t>
+      </w:r>
+    </w:p>
+    <w:p>
+      <w:pPr>
+        <w:spacing w:before="100" w:after="120" w:line="276" w:lineRule="auto"/>
       </w:pPr>
       <w:r>
         <w:rPr>
@@ -8231,7 +8183,7 @@
     </w:p>
     <w:p>
       <w:pPr>
-        <w:spacing w:before="280" w:after="120" w:line="276" w:lineRule="auto"/>
+        <w:spacing w:before="100" w:after="120" w:line="276" w:lineRule="auto"/>
       </w:pPr>
       <w:r>
         <w:rPr>
@@ -8546,7 +8498,7 @@
     </w:p>
     <w:p>
       <w:pPr>
-        <w:spacing w:before="280" w:after="120" w:line="276" w:lineRule="auto"/>
+        <w:spacing w:before="100" w:after="120" w:line="276" w:lineRule="auto"/>
       </w:pPr>
       <w:r>
         <w:rPr>
@@ -8891,7 +8843,7 @@
     </w:p>
     <w:p>
       <w:pPr>
-        <w:spacing w:before="280" w:after="120" w:line="276" w:lineRule="auto"/>
+        <w:spacing w:before="100" w:after="120" w:line="276" w:lineRule="auto"/>
       </w:pPr>
       <w:r>
         <w:rPr>
@@ -9398,7 +9350,7 @@
     </w:p>
     <w:p>
       <w:pPr>
-        <w:spacing w:before="280" w:after="120" w:line="276" w:lineRule="auto"/>
+        <w:spacing w:before="100" w:after="120" w:line="276" w:lineRule="auto"/>
       </w:pPr>
       <w:r>
         <w:rPr>
@@ -9582,7 +9534,7 @@
     </w:p>
     <w:p>
       <w:pPr>
-        <w:spacing w:before="280" w:after="120" w:line="276" w:lineRule="auto"/>
+        <w:spacing w:before="100" w:after="120" w:line="276" w:lineRule="auto"/>
       </w:pPr>
       <w:r>
         <w:rPr>
@@ -9787,7 +9739,7 @@
     </w:p>
     <w:p>
       <w:pPr>
-        <w:spacing w:before="280" w:after="120" w:line="276" w:lineRule="auto"/>
+        <w:spacing w:before="100" w:after="120" w:line="276" w:lineRule="auto"/>
       </w:pPr>
       <w:r>
         <w:rPr>
@@ -10436,8 +10388,16 @@
       </w:r>
     </w:p>
     <w:p>
-      <w:r>
-        <w:br w:type="page"/>
+      <w:pPr>
+        <w:spacing w:before="60" w:after="60"/>
+        <w:shd w:val="clear" w:color="auto" w:fill="C9A227"/>
+      </w:pPr>
+      <w:r>
+        <w:rPr>
+          <w:sz w:val="2"/>
+          <w:szCs w:val="2"/>
+        </w:rPr>
+        <w:t xml:space="preserve"> </w:t>
       </w:r>
     </w:p>
     <w:p>
@@ -10521,13 +10481,21 @@
       </w:r>
     </w:p>
     <w:p>
-      <w:r>
-        <w:br w:type="page"/>
-      </w:r>
-    </w:p>
-    <w:p>
-      <w:pPr>
-        <w:spacing w:before="280" w:after="120" w:line="276" w:lineRule="auto"/>
+      <w:pPr>
+        <w:spacing w:before="60" w:after="60"/>
+        <w:shd w:val="clear" w:color="auto" w:fill="C9A227"/>
+      </w:pPr>
+      <w:r>
+        <w:rPr>
+          <w:sz w:val="2"/>
+          <w:szCs w:val="2"/>
+        </w:rPr>
+        <w:t xml:space="preserve"> </w:t>
+      </w:r>
+    </w:p>
+    <w:p>
+      <w:pPr>
+        <w:spacing w:before="100" w:after="120" w:line="276" w:lineRule="auto"/>
       </w:pPr>
       <w:r>
         <w:rPr>
@@ -10911,18 +10879,6 @@
     </w:tbl>
     <w:p>
       <w:pPr>
-        <w:spacing w:before="0" w:after="120" w:line="276" w:lineRule="auto"/>
-      </w:pPr>
-      <w:r>
-        <w:rPr>
-          <w:sz w:val="2"/>
-          <w:szCs w:val="2"/>
-        </w:rPr>
-        <w:t xml:space="preserve"> </w:t>
-      </w:r>
-    </w:p>
-    <w:p>
-      <w:pPr>
         <w:spacing w:before="180" w:after="40" w:line="276" w:lineRule="auto"/>
         <w:ind w:left="120"/>
         <w:shd w:val="clear" w:color="auto" w:fill="F3E5F5"/>
@@ -11162,7 +11118,7 @@
     </w:p>
     <w:p>
       <w:pPr>
-        <w:spacing w:before="280" w:after="120" w:line="276" w:lineRule="auto"/>
+        <w:spacing w:before="100" w:after="120" w:line="276" w:lineRule="auto"/>
       </w:pPr>
       <w:r>
         <w:rPr>
@@ -11191,7 +11147,7 @@
     </w:p>
     <w:p>
       <w:pPr>
-        <w:spacing w:before="200" w:after="80" w:line="276" w:lineRule="auto"/>
+        <w:spacing w:before="100" w:after="80" w:line="276" w:lineRule="auto"/>
         <w:shd w:val="clear" w:color="auto" w:fill="0D2745"/>
       </w:pPr>
       <w:r>
@@ -11307,7 +11263,7 @@
     </w:p>
     <w:p>
       <w:pPr>
-        <w:spacing w:before="200" w:after="80" w:line="276" w:lineRule="auto"/>
+        <w:spacing w:before="100" w:after="80" w:line="276" w:lineRule="auto"/>
         <w:shd w:val="clear" w:color="auto" w:fill="0D2745"/>
       </w:pPr>
       <w:r>
@@ -11423,7 +11379,7 @@
     </w:p>
     <w:p>
       <w:pPr>
-        <w:spacing w:before="200" w:after="80" w:line="276" w:lineRule="auto"/>
+        <w:spacing w:before="100" w:after="80" w:line="276" w:lineRule="auto"/>
         <w:shd w:val="clear" w:color="auto" w:fill="0D2745"/>
       </w:pPr>
       <w:r>
@@ -11539,7 +11495,7 @@
     </w:p>
     <w:p>
       <w:pPr>
-        <w:spacing w:before="200" w:after="80" w:line="276" w:lineRule="auto"/>
+        <w:spacing w:before="100" w:after="80" w:line="276" w:lineRule="auto"/>
         <w:shd w:val="clear" w:color="auto" w:fill="0D2745"/>
       </w:pPr>
       <w:r>
@@ -11655,7 +11611,7 @@
     </w:p>
     <w:p>
       <w:pPr>
-        <w:spacing w:before="200" w:after="80" w:line="276" w:lineRule="auto"/>
+        <w:spacing w:before="100" w:after="80" w:line="276" w:lineRule="auto"/>
         <w:shd w:val="clear" w:color="auto" w:fill="0D2745"/>
       </w:pPr>
       <w:r>
@@ -11771,7 +11727,7 @@
     </w:p>
     <w:p>
       <w:pPr>
-        <w:spacing w:before="200" w:after="80" w:line="276" w:lineRule="auto"/>
+        <w:spacing w:before="100" w:after="80" w:line="276" w:lineRule="auto"/>
         <w:shd w:val="clear" w:color="auto" w:fill="0D2745"/>
       </w:pPr>
       <w:r>
@@ -11887,7 +11843,7 @@
     </w:p>
     <w:p>
       <w:pPr>
-        <w:spacing w:before="200" w:after="80" w:line="276" w:lineRule="auto"/>
+        <w:spacing w:before="100" w:after="80" w:line="276" w:lineRule="auto"/>
         <w:shd w:val="clear" w:color="auto" w:fill="0D2745"/>
       </w:pPr>
       <w:r>
@@ -12003,7 +11959,7 @@
     </w:p>
     <w:p>
       <w:pPr>
-        <w:spacing w:before="200" w:after="80" w:line="276" w:lineRule="auto"/>
+        <w:spacing w:before="100" w:after="80" w:line="276" w:lineRule="auto"/>
         <w:shd w:val="clear" w:color="auto" w:fill="0D2745"/>
       </w:pPr>
       <w:r>
@@ -12119,7 +12075,7 @@
     </w:p>
     <w:p>
       <w:pPr>
-        <w:spacing w:before="200" w:after="80" w:line="276" w:lineRule="auto"/>
+        <w:spacing w:before="100" w:after="80" w:line="276" w:lineRule="auto"/>
         <w:shd w:val="clear" w:color="auto" w:fill="0D2745"/>
       </w:pPr>
       <w:r>
@@ -12235,7 +12191,7 @@
     </w:p>
     <w:p>
       <w:pPr>
-        <w:spacing w:before="200" w:after="80" w:line="276" w:lineRule="auto"/>
+        <w:spacing w:before="100" w:after="80" w:line="276" w:lineRule="auto"/>
         <w:shd w:val="clear" w:color="auto" w:fill="0D2745"/>
       </w:pPr>
       <w:r>
@@ -12351,7 +12307,7 @@
     </w:p>
     <w:p>
       <w:pPr>
-        <w:spacing w:before="200" w:after="80" w:line="276" w:lineRule="auto"/>
+        <w:spacing w:before="100" w:after="80" w:line="276" w:lineRule="auto"/>
         <w:shd w:val="clear" w:color="auto" w:fill="0D2745"/>
       </w:pPr>
       <w:r>
@@ -12467,7 +12423,7 @@
     </w:p>
     <w:p>
       <w:pPr>
-        <w:spacing w:before="200" w:after="80" w:line="276" w:lineRule="auto"/>
+        <w:spacing w:before="100" w:after="80" w:line="276" w:lineRule="auto"/>
         <w:shd w:val="clear" w:color="auto" w:fill="0D2745"/>
       </w:pPr>
       <w:r>
@@ -12583,7 +12539,7 @@
     </w:p>
     <w:p>
       <w:pPr>
-        <w:spacing w:before="280" w:after="120" w:line="276" w:lineRule="auto"/>
+        <w:spacing w:before="100" w:after="120" w:line="276" w:lineRule="auto"/>
       </w:pPr>
       <w:r>
         <w:rPr>
@@ -13800,18 +13756,6 @@
     </w:tbl>
     <w:p>
       <w:pPr>
-        <w:spacing w:before="0" w:after="120" w:line="276" w:lineRule="auto"/>
-      </w:pPr>
-      <w:r>
-        <w:rPr>
-          <w:sz w:val="2"/>
-          <w:szCs w:val="2"/>
-        </w:rPr>
-        <w:t xml:space="preserve"> </w:t>
-      </w:r>
-    </w:p>
-    <w:p>
-      <w:pPr>
         <w:spacing w:before="180" w:after="40" w:line="276" w:lineRule="auto"/>
         <w:ind w:left="120"/>
         <w:shd w:val="clear" w:color="auto" w:fill="E8F5E9"/>
@@ -14008,8 +13952,16 @@
       </w:r>
     </w:p>
     <w:p>
-      <w:r>
-        <w:br w:type="page"/>
+      <w:pPr>
+        <w:spacing w:before="60" w:after="60"/>
+        <w:shd w:val="clear" w:color="auto" w:fill="C9A227"/>
+      </w:pPr>
+      <w:r>
+        <w:rPr>
+          <w:sz w:val="2"/>
+          <w:szCs w:val="2"/>
+        </w:rPr>
+        <w:t xml:space="preserve"> </w:t>
       </w:r>
     </w:p>
     <w:p>
@@ -14093,8 +14045,16 @@
       </w:r>
     </w:p>
     <w:p>
-      <w:r>
-        <w:br w:type="page"/>
+      <w:pPr>
+        <w:spacing w:before="60" w:after="60"/>
+        <w:shd w:val="clear" w:color="auto" w:fill="C9A227"/>
+      </w:pPr>
+      <w:r>
+        <w:rPr>
+          <w:sz w:val="2"/>
+          <w:szCs w:val="2"/>
+        </w:rPr>
+        <w:t xml:space="preserve"> </w:t>
       </w:r>
     </w:p>
     <w:p>
@@ -14498,7 +14458,7 @@
     </w:p>
     <w:p>
       <w:pPr>
-        <w:spacing w:before="280" w:after="120" w:line="276" w:lineRule="auto"/>
+        <w:spacing w:before="100" w:after="120" w:line="276" w:lineRule="auto"/>
       </w:pPr>
       <w:r>
         <w:rPr>
@@ -14886,30 +14846,26 @@
       </w:pPr>
       <w:r>
         <w:rPr>
+          <w:b/>
+          <w:bCs/>
+          <w:color w:val="424242"/>
+          <w:sz w:val="22"/>
+          <w:szCs w:val="22"/>
+        </w:rPr>
+        <w:t xml:space="preserve">Saham Tier S/A + broker kuat di broker summary = TOP PICK besok.</w:t>
+      </w:r>
+    </w:p>
+    <w:p>
+      <w:pPr>
+        <w:spacing w:before="60" w:after="60"/>
+        <w:shd w:val="clear" w:color="auto" w:fill="C9A227"/>
+      </w:pPr>
+      <w:r>
+        <w:rPr>
           <w:sz w:val="2"/>
           <w:szCs w:val="2"/>
         </w:rPr>
         <w:t xml:space="preserve"> </w:t>
-      </w:r>
-    </w:p>
-    <w:p>
-      <w:pPr>
-        <w:spacing w:before="0" w:after="120" w:line="276" w:lineRule="auto"/>
-      </w:pPr>
-      <w:r>
-        <w:rPr>
-          <w:b/>
-          <w:bCs/>
-          <w:color w:val="424242"/>
-          <w:sz w:val="22"/>
-          <w:szCs w:val="22"/>
-        </w:rPr>
-        <w:t xml:space="preserve">Saham Tier S/A + broker kuat di broker summary = TOP PICK besok.</w:t>
-      </w:r>
-    </w:p>
-    <w:p>
-      <w:r>
-        <w:br w:type="page"/>
       </w:r>
     </w:p>
     <w:p>
@@ -14993,13 +14949,21 @@
       </w:r>
     </w:p>
     <w:p>
-      <w:r>
-        <w:br w:type="page"/>
-      </w:r>
-    </w:p>
-    <w:p>
-      <w:pPr>
-        <w:spacing w:before="280" w:after="120" w:line="276" w:lineRule="auto"/>
+      <w:pPr>
+        <w:spacing w:before="60" w:after="60"/>
+        <w:shd w:val="clear" w:color="auto" w:fill="C9A227"/>
+      </w:pPr>
+      <w:r>
+        <w:rPr>
+          <w:sz w:val="2"/>
+          <w:szCs w:val="2"/>
+        </w:rPr>
+        <w:t xml:space="preserve"> </w:t>
+      </w:r>
+    </w:p>
+    <w:p>
+      <w:pPr>
+        <w:spacing w:before="100" w:after="120" w:line="276" w:lineRule="auto"/>
       </w:pPr>
       <w:r>
         <w:rPr>
@@ -15460,19 +15424,7 @@
     </w:tbl>
     <w:p>
       <w:pPr>
-        <w:spacing w:before="0" w:after="120" w:line="276" w:lineRule="auto"/>
-      </w:pPr>
-      <w:r>
-        <w:rPr>
-          <w:sz w:val="2"/>
-          <w:szCs w:val="2"/>
-        </w:rPr>
-        <w:t xml:space="preserve"> </w:t>
-      </w:r>
-    </w:p>
-    <w:p>
-      <w:pPr>
-        <w:spacing w:before="280" w:after="120" w:line="276" w:lineRule="auto"/>
+        <w:spacing w:before="100" w:after="120" w:line="276" w:lineRule="auto"/>
       </w:pPr>
       <w:r>
         <w:rPr>
@@ -15850,19 +15802,7 @@
     </w:tbl>
     <w:p>
       <w:pPr>
-        <w:spacing w:before="0" w:after="120" w:line="276" w:lineRule="auto"/>
-      </w:pPr>
-      <w:r>
-        <w:rPr>
-          <w:sz w:val="2"/>
-          <w:szCs w:val="2"/>
-        </w:rPr>
-        <w:t xml:space="preserve"> </w:t>
-      </w:r>
-    </w:p>
-    <w:p>
-      <w:pPr>
-        <w:spacing w:before="280" w:after="120" w:line="276" w:lineRule="auto"/>
+        <w:spacing w:before="100" w:after="120" w:line="276" w:lineRule="auto"/>
       </w:pPr>
       <w:r>
         <w:rPr>
@@ -15891,7 +15831,7 @@
     </w:p>
     <w:p>
       <w:pPr>
-        <w:spacing w:before="280" w:after="120" w:line="276" w:lineRule="auto"/>
+        <w:spacing w:before="100" w:after="120" w:line="276" w:lineRule="auto"/>
       </w:pPr>
       <w:r>
         <w:rPr>
@@ -16208,19 +16148,7 @@
     </w:tbl>
     <w:p>
       <w:pPr>
-        <w:spacing w:before="0" w:after="120" w:line="276" w:lineRule="auto"/>
-      </w:pPr>
-      <w:r>
-        <w:rPr>
-          <w:sz w:val="2"/>
-          <w:szCs w:val="2"/>
-        </w:rPr>
-        <w:t xml:space="preserve"> </w:t>
-      </w:r>
-    </w:p>
-    <w:p>
-      <w:pPr>
-        <w:spacing w:before="280" w:after="120" w:line="276" w:lineRule="auto"/>
+        <w:spacing w:before="100" w:after="120" w:line="276" w:lineRule="auto"/>
       </w:pPr>
       <w:r>
         <w:rPr>
@@ -16495,30 +16423,26 @@
       </w:pPr>
       <w:r>
         <w:rPr>
+          <w:b/>
+          <w:bCs/>
+          <w:color w:val="C62828"/>
+          <w:sz w:val="22"/>
+          <w:szCs w:val="22"/>
+        </w:rPr>
+        <w:t xml:space="preserve">Jaga DD &lt; 15%. Kalau kena daily limit -2%, STOP. Besok masih bisa trading.</w:t>
+      </w:r>
+    </w:p>
+    <w:p>
+      <w:pPr>
+        <w:spacing w:before="60" w:after="60"/>
+        <w:shd w:val="clear" w:color="auto" w:fill="C9A227"/>
+      </w:pPr>
+      <w:r>
+        <w:rPr>
           <w:sz w:val="2"/>
           <w:szCs w:val="2"/>
         </w:rPr>
         <w:t xml:space="preserve"> </w:t>
-      </w:r>
-    </w:p>
-    <w:p>
-      <w:pPr>
-        <w:spacing w:before="0" w:after="120" w:line="276" w:lineRule="auto"/>
-      </w:pPr>
-      <w:r>
-        <w:rPr>
-          <w:b/>
-          <w:bCs/>
-          <w:color w:val="C62828"/>
-          <w:sz w:val="22"/>
-          <w:szCs w:val="22"/>
-        </w:rPr>
-        <w:t xml:space="preserve">Jaga DD &lt; 15%. Kalau kena daily limit -2%, STOP. Besok masih bisa trading.</w:t>
-      </w:r>
-    </w:p>
-    <w:p>
-      <w:r>
-        <w:br w:type="page"/>
       </w:r>
     </w:p>
     <w:p>
@@ -16602,13 +16526,21 @@
       </w:r>
     </w:p>
     <w:p>
-      <w:r>
-        <w:br w:type="page"/>
-      </w:r>
-    </w:p>
-    <w:p>
-      <w:pPr>
-        <w:spacing w:before="280" w:after="120" w:line="276" w:lineRule="auto"/>
+      <w:pPr>
+        <w:spacing w:before="60" w:after="60"/>
+        <w:shd w:val="clear" w:color="auto" w:fill="C9A227"/>
+      </w:pPr>
+      <w:r>
+        <w:rPr>
+          <w:sz w:val="2"/>
+          <w:szCs w:val="2"/>
+        </w:rPr>
+        <w:t xml:space="preserve"> </w:t>
+      </w:r>
+    </w:p>
+    <w:p>
+      <w:pPr>
+        <w:spacing w:before="100" w:after="120" w:line="276" w:lineRule="auto"/>
       </w:pPr>
       <w:r>
         <w:rPr>
@@ -17155,19 +17087,7 @@
     </w:tbl>
     <w:p>
       <w:pPr>
-        <w:spacing w:before="0" w:after="120" w:line="276" w:lineRule="auto"/>
-      </w:pPr>
-      <w:r>
-        <w:rPr>
-          <w:sz w:val="2"/>
-          <w:szCs w:val="2"/>
-        </w:rPr>
-        <w:t xml:space="preserve"> </w:t>
-      </w:r>
-    </w:p>
-    <w:p>
-      <w:pPr>
-        <w:spacing w:before="280" w:after="120" w:line="276" w:lineRule="auto"/>
+        <w:spacing w:before="100" w:after="120" w:line="276" w:lineRule="auto"/>
       </w:pPr>
       <w:r>
         <w:rPr>
@@ -17320,7 +17240,7 @@
     </w:p>
     <w:p>
       <w:pPr>
-        <w:spacing w:before="280" w:after="120" w:line="276" w:lineRule="auto"/>
+        <w:spacing w:before="100" w:after="120" w:line="276" w:lineRule="auto"/>
       </w:pPr>
       <w:r>
         <w:rPr>
@@ -17591,7 +17511,7 @@
     </w:p>
     <w:p>
       <w:pPr>
-        <w:spacing w:before="280" w:after="120" w:line="276" w:lineRule="auto"/>
+        <w:spacing w:before="100" w:after="120" w:line="276" w:lineRule="auto"/>
       </w:pPr>
       <w:r>
         <w:rPr>
@@ -17789,8 +17709,16 @@
       </w:r>
     </w:p>
     <w:p>
-      <w:r>
-        <w:br w:type="page"/>
+      <w:pPr>
+        <w:spacing w:before="60" w:after="60"/>
+        <w:shd w:val="clear" w:color="auto" w:fill="C9A227"/>
+      </w:pPr>
+      <w:r>
+        <w:rPr>
+          <w:sz w:val="2"/>
+          <w:szCs w:val="2"/>
+        </w:rPr>
+        <w:t xml:space="preserve"> </w:t>
       </w:r>
     </w:p>
     <w:p>
@@ -17874,13 +17802,21 @@
       </w:r>
     </w:p>
     <w:p>
-      <w:r>
-        <w:br w:type="page"/>
-      </w:r>
-    </w:p>
-    <w:p>
-      <w:pPr>
-        <w:spacing w:before="280" w:after="120" w:line="276" w:lineRule="auto"/>
+      <w:pPr>
+        <w:spacing w:before="60" w:after="60"/>
+        <w:shd w:val="clear" w:color="auto" w:fill="C9A227"/>
+      </w:pPr>
+      <w:r>
+        <w:rPr>
+          <w:sz w:val="2"/>
+          <w:szCs w:val="2"/>
+        </w:rPr>
+        <w:t xml:space="preserve"> </w:t>
+      </w:r>
+    </w:p>
+    <w:p>
+      <w:pPr>
+        <w:spacing w:before="100" w:after="120" w:line="276" w:lineRule="auto"/>
       </w:pPr>
       <w:r>
         <w:rPr>
@@ -18267,13 +18203,21 @@
       </w:r>
     </w:p>
     <w:p>
-      <w:r>
-        <w:br w:type="page"/>
-      </w:r>
-    </w:p>
-    <w:p>
-      <w:pPr>
-        <w:spacing w:before="280" w:after="120" w:line="276" w:lineRule="auto"/>
+      <w:pPr>
+        <w:spacing w:before="60" w:after="60"/>
+        <w:shd w:val="clear" w:color="auto" w:fill="C9A227"/>
+      </w:pPr>
+      <w:r>
+        <w:rPr>
+          <w:sz w:val="2"/>
+          <w:szCs w:val="2"/>
+        </w:rPr>
+        <w:t xml:space="preserve"> </w:t>
+      </w:r>
+    </w:p>
+    <w:p>
+      <w:pPr>
+        <w:spacing w:before="100" w:after="120" w:line="276" w:lineRule="auto"/>
       </w:pPr>
       <w:r>
         <w:rPr>
@@ -18366,7 +18310,7 @@
     </w:p>
     <w:p>
       <w:pPr>
-        <w:spacing w:before="280" w:after="120" w:line="276" w:lineRule="auto"/>
+        <w:spacing w:before="100" w:after="120" w:line="276" w:lineRule="auto"/>
       </w:pPr>
       <w:r>
         <w:rPr>
@@ -18549,13 +18493,21 @@
       </w:r>
     </w:p>
     <w:p>
-      <w:r>
-        <w:br w:type="page"/>
-      </w:r>
-    </w:p>
-    <w:p>
-      <w:pPr>
-        <w:spacing w:before="200" w:after="120" w:line="276" w:lineRule="auto"/>
+      <w:pPr>
+        <w:spacing w:before="60" w:after="60"/>
+        <w:shd w:val="clear" w:color="auto" w:fill="C9A227"/>
+      </w:pPr>
+      <w:r>
+        <w:rPr>
+          <w:sz w:val="2"/>
+          <w:szCs w:val="2"/>
+        </w:rPr>
+        <w:t xml:space="preserve"> </w:t>
+      </w:r>
+    </w:p>
+    <w:p>
+      <w:pPr>
+        <w:spacing w:before="100" w:after="120" w:line="276" w:lineRule="auto"/>
       </w:pPr>
       <w:r>
         <w:rPr>

</xml_diff>

<commit_message>
Fix: nomor bab diurutkan benar 1-9, tanpa halaman kosong
</commit_message>
<xml_diff>
--- a/Panduan_Scalping_Edisi_Lengkap.docx
+++ b/Panduan_Scalping_Edisi_Lengkap.docx
@@ -3252,7 +3252,7 @@
           <w:sz w:val="32"/>
           <w:szCs w:val="32"/>
         </w:rPr>
-        <w:t xml:space="preserve">BAB 6</w:t>
+        <w:t xml:space="preserve">BAB 2</w:t>
       </w:r>
     </w:p>
     <w:p>
@@ -4825,7 +4825,7 @@
           <w:sz w:val="32"/>
           <w:szCs w:val="32"/>
         </w:rPr>
-        <w:t xml:space="preserve">BAB 7</w:t>
+        <w:t xml:space="preserve">BAB 3</w:t>
       </w:r>
     </w:p>
     <w:p>
@@ -5668,7 +5668,7 @@
           <w:sz w:val="32"/>
           <w:szCs w:val="32"/>
         </w:rPr>
-        <w:t xml:space="preserve">BAB 8</w:t>
+        <w:t xml:space="preserve">BAB 4</w:t>
       </w:r>
     </w:p>
     <w:p>
@@ -7861,7 +7861,7 @@
           <w:sz w:val="32"/>
           <w:szCs w:val="32"/>
         </w:rPr>
-        <w:t xml:space="preserve">BAB 9</w:t>
+        <w:t xml:space="preserve">BAB 5</w:t>
       </w:r>
     </w:p>
     <w:p>
@@ -10428,7 +10428,7 @@
           <w:sz w:val="32"/>
           <w:szCs w:val="32"/>
         </w:rPr>
-        <w:t xml:space="preserve">BAB 10</w:t>
+        <w:t xml:space="preserve">BAB 6</w:t>
       </w:r>
     </w:p>
     <w:p>

</xml_diff>